<commit_message>
UX84: Simplify Coding controls and unify English teaching examples
319 Node tests pass; 345 Python tests complete with 3 existing skips; JS syntax, source diff and Next static build pass. Local and online each 8 UI and 8 website checks; full original Bologna 15 window regressions; five standalone scripts reproduce exact exports; 15 Word pages rendered. Original Italian assets archived intact; statistics and plotting source unchanged. QT-only deployment with rollback, verified served hashes and isolated gateway reload; no Git push; Windows deferred.
</commit_message>
<xml_diff>
--- a/website/public/worked-example/research-report.docx
+++ b/website/public/worked-example/research-report.docx
@@ -26,7 +26,7 @@
       </w:pPr>
       <w:r>
         <w:rPr/>
-        <w:t xml:space="preserve">Saved version 2 · 2026-10-18</w:t>
+        <w:t xml:space="preserve">Saved version 1 · 2026-10-20</w:t>
       </w:r>
     </w:p>
     <w:p>
@@ -71,7 +71,7 @@
       </w:r>
       <w:r>
         <w:rPr/>
-        <w:t xml:space="preserve">The corpus has 19 public interview documents. The short written example below reviews selected passages from interview02.txt.</w:t>
+        <w:t xml:space="preserve">This English teaching subset contains selected translated passages from three public Bologna interviews. The Notebook covers all excerpts selected from interview02.txt, not the full original interview.</w:t>
       </w:r>
     </w:p>
     <w:p>
@@ -143,7 +143,7 @@
       </w:pPr>
       <w:r>
         <w:rPr/>
-        <w:t xml:space="preserve">This is a worked software example using the original Bologna coding. No new coding or participant interpretation was generated. Table labels retain the saved ancestry. Method steps show the workflow; unchecked review stages remain unconfirmed.</w:t>
+        <w:t xml:space="preserve">This is a worked software example using translated Bologna excerpts and source-linked teaching associations. Translated offsets refer to the English teaching documents, not the Italian originals. This is not a new empirical analysis. Table labels retain the saved ancestry. Method steps show the workflow; unchecked review stages remain unconfirmed.</w:t>
       </w:r>
     </w:p>
     <w:p>
@@ -458,11 +458,11 @@
       </w:pPr>
       <w:r>
         <w:rPr/>
-        <w:t xml:space="preserve">Saved report version 2</w:t>
+        <w:t xml:space="preserve">Saved report version 1</w:t>
         <w:br/>
         <w:t xml:space="preserve">method-map schema v1</w:t>
         <w:br/>
-        <w:t xml:space="preserve">Coding source SHA256 c41fb0c1685d251ca701f358aae3975d978bae146a0c0d50b5b91365d0e26b5d</w:t>
+        <w:t xml:space="preserve">Coding source SHA256 41dc40a938873e1710d074b85f545f008812e4865616a74f8dc4f54df8a7f3d6</w:t>
       </w:r>
     </w:p>
     <w:p>
@@ -801,7 +801,7 @@
       </w:pPr>
       <w:r>
         <w:rPr/>
-        <w:t xml:space="preserve">The selected passages describe different forms of research material. Their saved paths place these distinctions inside the materials group. Read the exact quotations before judging how well each code fits. [E1] [E3] [E2]</w:t>
+        <w:t xml:space="preserve">The selected passages describe different forms of research material. Their saved paths place these distinctions inside the materials group. Read the exact quotations before judging how well each code fits. [E2] [E3] [E1]</w:t>
         <w:br/>
         <w:t xml:space="preserve">The five figures summarize all existing codings across the corpus. They support checking the record; they do not substitute for interpretation of the interviews.</w:t>
       </w:r>
@@ -821,6 +821,60 @@
       </w:pPr>
       <w:r>
         <w:rPr/>
+        <w:t xml:space="preserve">The saved code distinguishes a form of research material in this passage. [E2]</w:t>
+      </w:r>
+    </w:p>
+    <w:p>
+      <w:pPr>
+        <w:pStyle w:val="Meta"/>
+      </w:pPr>
+      <w:r>
+        <w:rPr/>
+        <w:t xml:space="preserve">Table row 1 · Evidence E2</w:t>
+      </w:r>
+    </w:p>
+    <w:p>
+      <w:pPr>
+        <w:pStyle w:val="Heading3"/>
+      </w:pPr>
+      <w:r>
+        <w:rPr/>
+        <w:t xml:space="preserve">publications, modern and contemporary &gt; publications stemming from the project &gt; critical editions &gt; structure of a critical edition</w:t>
+      </w:r>
+    </w:p>
+    <w:p>
+      <w:pPr>
+        <w:pStyle w:val="Normal"/>
+      </w:pPr>
+      <w:r>
+        <w:rPr/>
+        <w:t xml:space="preserve">The saved code distinguishes a form of research material in this passage. [E3]</w:t>
+      </w:r>
+    </w:p>
+    <w:p>
+      <w:pPr>
+        <w:pStyle w:val="Meta"/>
+      </w:pPr>
+      <w:r>
+        <w:rPr/>
+        <w:t xml:space="preserve">Table row 2 · Evidence E3</w:t>
+      </w:r>
+    </w:p>
+    <w:p>
+      <w:pPr>
+        <w:pStyle w:val="Heading3"/>
+      </w:pPr>
+      <w:r>
+        <w:rPr/>
+        <w:t xml:space="preserve">digital representations of cultural objects &gt; pros of using facsimiles and photographs</w:t>
+      </w:r>
+    </w:p>
+    <w:p>
+      <w:pPr>
+        <w:pStyle w:val="Normal"/>
+      </w:pPr>
+      <w:r>
+        <w:rPr/>
         <w:t xml:space="preserve">The saved code distinguishes a form of research material in this passage. [E1]</w:t>
       </w:r>
     </w:p>
@@ -830,61 +884,7 @@
       </w:pPr>
       <w:r>
         <w:rPr/>
-        <w:t xml:space="preserve">Table row 1 · Evidence E1</w:t>
-      </w:r>
-    </w:p>
-    <w:p>
-      <w:pPr>
-        <w:pStyle w:val="Heading3"/>
-      </w:pPr>
-      <w:r>
-        <w:rPr/>
-        <w:t xml:space="preserve">publications, modern and contemporary &gt; publications stemming from the project &gt; critical editions &gt; structure of a critical edition</w:t>
-      </w:r>
-    </w:p>
-    <w:p>
-      <w:pPr>
-        <w:pStyle w:val="Normal"/>
-      </w:pPr>
-      <w:r>
-        <w:rPr/>
-        <w:t xml:space="preserve">The saved code distinguishes a form of research material in this passage. [E3]</w:t>
-      </w:r>
-    </w:p>
-    <w:p>
-      <w:pPr>
-        <w:pStyle w:val="Meta"/>
-      </w:pPr>
-      <w:r>
-        <w:rPr/>
-        <w:t xml:space="preserve">Table row 2 · Evidence E3</w:t>
-      </w:r>
-    </w:p>
-    <w:p>
-      <w:pPr>
-        <w:pStyle w:val="Heading3"/>
-      </w:pPr>
-      <w:r>
-        <w:rPr/>
-        <w:t xml:space="preserve">digital representations of cultural objects &gt; pros of using facsimiles and photographs</w:t>
-      </w:r>
-    </w:p>
-    <w:p>
-      <w:pPr>
-        <w:pStyle w:val="Normal"/>
-      </w:pPr>
-      <w:r>
-        <w:rPr/>
-        <w:t xml:space="preserve">The saved code distinguishes a form of research material in this passage. [E2]</w:t>
-      </w:r>
-    </w:p>
-    <w:p>
-      <w:pPr>
-        <w:pStyle w:val="Meta"/>
-      </w:pPr>
-      <w:r>
-        <w:rPr/>
-        <w:t xml:space="preserve">Table row 3 · Evidence E2</w:t>
+        <w:t xml:space="preserve">Table row 3 · Evidence E1</w:t>
       </w:r>
     </w:p>
     <w:p>
@@ -966,7 +966,7 @@
       </w:pPr>
       <w:r>
         <w:rPr/>
-        <w:t xml:space="preserve">Quoted characters and code identities were checked against the saved source. All five figures use the complete original 19-document coding record and their existing counting rules.</w:t>
+        <w:t xml:space="preserve">Quoted characters and code identities were checked against the saved source. All five figures use only this three-document translated teaching subset and the unchanged counting rules.</w:t>
       </w:r>
     </w:p>
     <w:p>
@@ -1016,17 +1016,17 @@
       <w:r>
         <w:drawing>
           <wp:inline>
-            <wp:extent cx="6126480" cy="5347054"/>
+            <wp:extent cx="6126480" cy="3944086"/>
             <wp:docPr id="1001" name="Code frequency" descr="Code frequency"/>
             <a:graphic>
               <a:graphicData uri="http://schemas.openxmlformats.org/drawingml/2006/picture">
                 <pic:pic>
                   <pic:nvPicPr>
-                    <pic:cNvPr id="1001" name="imageec03e8690f56e2901daa6d50.png"/>
+                    <pic:cNvPr id="1001" name="image04301813b5fab397d8ea2cc1.png"/>
                     <pic:cNvPicPr/>
                   </pic:nvPicPr>
                   <pic:blipFill>
-                    <a:blip r:embed="imageec03e8690f56e2901daa6d50"/>
+                    <a:blip r:embed="image04301813b5fab397d8ea2cc1"/>
                     <a:stretch>
                       <a:fillRect/>
                     </a:stretch>
@@ -1034,7 +1034,7 @@
                   <pic:spPr>
                     <a:xfrm>
                       <a:off x="0" y="0"/>
-                      <a:ext cx="6126480" cy="5347054"/>
+                      <a:ext cx="6126480" cy="3944086"/>
                     </a:xfrm>
                     <a:prstGeom prst="rect">
                       <a:avLst/>
@@ -1063,7 +1063,7 @@
       </w:r>
       <w:r>
         <w:rPr/>
-        <w:t xml:space="preserve">Code frequency from the original saved coding record.</w:t>
+        <w:t xml:space="preserve">Code frequency from the English translation teaching subset.</w:t>
       </w:r>
     </w:p>
     <w:p>
@@ -1095,17 +1095,17 @@
       <w:r>
         <w:drawing>
           <wp:inline>
-            <wp:extent cx="6126480" cy="5054773"/>
+            <wp:extent cx="6126480" cy="4544497"/>
             <wp:docPr id="2001" name="Code-by-interview matrix" descr="Code-by-interview matrix"/>
             <a:graphic>
               <a:graphicData uri="http://schemas.openxmlformats.org/drawingml/2006/picture">
                 <pic:pic>
                   <pic:nvPicPr>
-                    <pic:cNvPr id="2001" name="image236d1bb6754b5bc36f61349f.png"/>
+                    <pic:cNvPr id="2001" name="imagedacedbc1ffb0a2e0cf0c4fb5.png"/>
                     <pic:cNvPicPr/>
                   </pic:nvPicPr>
                   <pic:blipFill>
-                    <a:blip r:embed="image236d1bb6754b5bc36f61349f"/>
+                    <a:blip r:embed="imagedacedbc1ffb0a2e0cf0c4fb5"/>
                     <a:stretch>
                       <a:fillRect/>
                     </a:stretch>
@@ -1113,7 +1113,7 @@
                   <pic:spPr>
                     <a:xfrm>
                       <a:off x="0" y="0"/>
-                      <a:ext cx="6126480" cy="5054773"/>
+                      <a:ext cx="6126480" cy="4544497"/>
                     </a:xfrm>
                     <a:prstGeom prst="rect">
                       <a:avLst/>
@@ -1142,7 +1142,7 @@
       </w:r>
       <w:r>
         <w:rPr/>
-        <w:t xml:space="preserve">Code by interview from the original saved coding record.</w:t>
+        <w:t xml:space="preserve">Code by interview from the English translation teaching subset.</w:t>
       </w:r>
     </w:p>
     <w:p>
@@ -1174,17 +1174,17 @@
       <w:r>
         <w:drawing>
           <wp:inline>
-            <wp:extent cx="5551693" cy="5486400"/>
+            <wp:extent cx="5615172" cy="5486400"/>
             <wp:docPr id="3001" name="Overlapping-range co-occurrence" descr="Overlapping-range co-occurrence"/>
             <a:graphic>
               <a:graphicData uri="http://schemas.openxmlformats.org/drawingml/2006/picture">
                 <pic:pic>
                   <pic:nvPicPr>
-                    <pic:cNvPr id="3001" name="image9e0854f89c534e3ad137b9e6.png"/>
+                    <pic:cNvPr id="3001" name="image1c5a417cad78031c2d7b038e.png"/>
                     <pic:cNvPicPr/>
                   </pic:nvPicPr>
                   <pic:blipFill>
-                    <a:blip r:embed="image9e0854f89c534e3ad137b9e6"/>
+                    <a:blip r:embed="image1c5a417cad78031c2d7b038e"/>
                     <a:stretch>
                       <a:fillRect/>
                     </a:stretch>
@@ -1192,7 +1192,7 @@
                   <pic:spPr>
                     <a:xfrm>
                       <a:off x="0" y="0"/>
-                      <a:ext cx="5551693" cy="5486400"/>
+                      <a:ext cx="5615172" cy="5486400"/>
                     </a:xfrm>
                     <a:prstGeom prst="rect">
                       <a:avLst/>
@@ -1221,7 +1221,7 @@
       </w:r>
       <w:r>
         <w:rPr/>
-        <w:t xml:space="preserve">Code co-occurrence from the original saved coding record.</w:t>
+        <w:t xml:space="preserve">Code co-occurrence from the English translation teaching subset.</w:t>
       </w:r>
     </w:p>
     <w:p>
@@ -1240,7 +1240,7 @@
       </w:pPr>
       <w:r>
         <w:rPr/>
-        <w:t xml:space="preserve">Figure 4 · view 1 of 5</w:t>
+        <w:t xml:space="preserve">Figure 4</w:t>
       </w:r>
     </w:p>
     <w:p>
@@ -1253,18 +1253,17 @@
       <w:r>
         <w:drawing>
           <wp:inline>
-            <wp:extent cx="6126480" cy="5428600"/>
+            <wp:extent cx="6126480" cy="4565652"/>
             <wp:docPr id="4001" name="Themes and named subthemes" descr="Themes and named subthemes"/>
             <a:graphic>
               <a:graphicData uri="http://schemas.openxmlformats.org/drawingml/2006/picture">
                 <pic:pic>
                   <pic:nvPicPr>
-                    <pic:cNvPr id="4001" name="image3a4b897638fff480327fd049.png"/>
+                    <pic:cNvPr id="4001" name="image7d32c7cc8c56ee2dac44c71c.png"/>
                     <pic:cNvPicPr/>
                   </pic:nvPicPr>
                   <pic:blipFill>
-                    <a:blip r:embed="image3a4b897638fff480327fd049"/>
-                    <a:srcRect t="0" b="80021"/>
+                    <a:blip r:embed="image7d32c7cc8c56ee2dac44c71c"/>
                     <a:stretch>
                       <a:fillRect/>
                     </a:stretch>
@@ -1272,7 +1271,7 @@
                   <pic:spPr>
                     <a:xfrm>
                       <a:off x="0" y="0"/>
-                      <a:ext cx="6126480" cy="5428600"/>
+                      <a:ext cx="6126480" cy="4565652"/>
                     </a:xfrm>
                     <a:prstGeom prst="rect">
                       <a:avLst/>
@@ -1301,7 +1300,7 @@
       </w:r>
       <w:r>
         <w:rPr/>
-        <w:t xml:space="preserve">Theme hierarchy from the original saved coding record.</w:t>
+        <w:t xml:space="preserve">Theme hierarchy from the English translation teaching subset.</w:t>
       </w:r>
     </w:p>
     <w:p>
@@ -1311,371 +1310,6 @@
       <w:r>
         <w:rPr/>
         <w:t xml:space="preserve">Counts coded extracts per section and subsection, not participants.</w:t>
-      </w:r>
-    </w:p>
-    <w:p>
-      <w:pPr>
-        <w:pStyle w:val="Meta"/>
-      </w:pPr>
-      <w:r>
-        <w:rPr/>
-        <w:t xml:space="preserve">Unchanged original · continuous view 1 of 5. Complete SVG, PDF and PNG are in the report ZIP.</w:t>
-      </w:r>
-    </w:p>
-    <w:p>
-      <w:pPr>
-        <w:pStyle w:val="Heading2"/>
-        <w:pageBreakBefore/>
-      </w:pPr>
-      <w:r>
-        <w:rPr/>
-        <w:t xml:space="preserve">Figure 4 · view 2 of 5</w:t>
-      </w:r>
-    </w:p>
-    <w:p>
-      <w:pPr>
-        <w:spacing w:before="0" w:after="120" w:line="240" w:lineRule="auto"/>
-        <w:jc w:val="center"/>
-        <w:keepLines/>
-        <w:keepNext/>
-      </w:pPr>
-      <w:r>
-        <w:drawing>
-          <wp:inline>
-            <wp:extent cx="6126480" cy="5441099"/>
-            <wp:docPr id="4002" name="Themes and named subthemes" descr="Themes and named subthemes"/>
-            <a:graphic>
-              <a:graphicData uri="http://schemas.openxmlformats.org/drawingml/2006/picture">
-                <pic:pic>
-                  <pic:nvPicPr>
-                    <pic:cNvPr id="4002" name="image3a4b897638fff480327fd049.png"/>
-                    <pic:cNvPicPr/>
-                  </pic:nvPicPr>
-                  <pic:blipFill>
-                    <a:blip r:embed="image3a4b897638fff480327fd049"/>
-                    <a:srcRect t="19979" b="59996"/>
-                    <a:stretch>
-                      <a:fillRect/>
-                    </a:stretch>
-                  </pic:blipFill>
-                  <pic:spPr>
-                    <a:xfrm>
-                      <a:off x="0" y="0"/>
-                      <a:ext cx="6126480" cy="5441099"/>
-                    </a:xfrm>
-                    <a:prstGeom prst="rect">
-                      <a:avLst/>
-                    </a:prstGeom>
-                  </pic:spPr>
-                </pic:pic>
-              </a:graphicData>
-            </a:graphic>
-          </wp:inline>
-        </w:drawing>
-      </w:r>
-    </w:p>
-    <w:p>
-      <w:pPr>
-        <w:pStyle w:val="FigureCaption"/>
-        <w:keepNext/>
-      </w:pPr>
-      <w:r>
-        <w:rPr/>
-      </w:r>
-      <w:r>
-        <w:rPr>
-          <w:b/>
-        </w:rPr>
-        <w:t xml:space="preserve">Themes and named subthemes. </w:t>
-      </w:r>
-      <w:r>
-        <w:rPr/>
-        <w:t xml:space="preserve">Theme hierarchy from the original saved coding record.</w:t>
-      </w:r>
-    </w:p>
-    <w:p>
-      <w:pPr>
-        <w:pStyle w:val="Meta"/>
-      </w:pPr>
-      <w:r>
-        <w:rPr/>
-        <w:t xml:space="preserve">Counts coded extracts per section and subsection, not participants.</w:t>
-      </w:r>
-    </w:p>
-    <w:p>
-      <w:pPr>
-        <w:pStyle w:val="Meta"/>
-      </w:pPr>
-      <w:r>
-        <w:rPr/>
-        <w:t xml:space="preserve">Unchanged original · continuous view 2 of 5. Complete SVG, PDF and PNG are in the report ZIP.</w:t>
-      </w:r>
-    </w:p>
-    <w:p>
-      <w:pPr>
-        <w:pStyle w:val="Heading2"/>
-        <w:pageBreakBefore/>
-      </w:pPr>
-      <w:r>
-        <w:rPr/>
-        <w:t xml:space="preserve">Figure 4 · view 3 of 5</w:t>
-      </w:r>
-    </w:p>
-    <w:p>
-      <w:pPr>
-        <w:spacing w:before="0" w:after="120" w:line="240" w:lineRule="auto"/>
-        <w:jc w:val="center"/>
-        <w:keepLines/>
-        <w:keepNext/>
-      </w:pPr>
-      <w:r>
-        <w:drawing>
-          <wp:inline>
-            <wp:extent cx="6126480" cy="5448164"/>
-            <wp:docPr id="4003" name="Themes and named subthemes" descr="Themes and named subthemes"/>
-            <a:graphic>
-              <a:graphicData uri="http://schemas.openxmlformats.org/drawingml/2006/picture">
-                <pic:pic>
-                  <pic:nvPicPr>
-                    <pic:cNvPr id="4003" name="image3a4b897638fff480327fd049.png"/>
-                    <pic:cNvPicPr/>
-                  </pic:nvPicPr>
-                  <pic:blipFill>
-                    <a:blip r:embed="image3a4b897638fff480327fd049"/>
-                    <a:srcRect t="40004" b="39945"/>
-                    <a:stretch>
-                      <a:fillRect/>
-                    </a:stretch>
-                  </pic:blipFill>
-                  <pic:spPr>
-                    <a:xfrm>
-                      <a:off x="0" y="0"/>
-                      <a:ext cx="6126480" cy="5448164"/>
-                    </a:xfrm>
-                    <a:prstGeom prst="rect">
-                      <a:avLst/>
-                    </a:prstGeom>
-                  </pic:spPr>
-                </pic:pic>
-              </a:graphicData>
-            </a:graphic>
-          </wp:inline>
-        </w:drawing>
-      </w:r>
-    </w:p>
-    <w:p>
-      <w:pPr>
-        <w:pStyle w:val="FigureCaption"/>
-        <w:keepNext/>
-      </w:pPr>
-      <w:r>
-        <w:rPr/>
-      </w:r>
-      <w:r>
-        <w:rPr>
-          <w:b/>
-        </w:rPr>
-        <w:t xml:space="preserve">Themes and named subthemes. </w:t>
-      </w:r>
-      <w:r>
-        <w:rPr/>
-        <w:t xml:space="preserve">Theme hierarchy from the original saved coding record.</w:t>
-      </w:r>
-    </w:p>
-    <w:p>
-      <w:pPr>
-        <w:pStyle w:val="Meta"/>
-      </w:pPr>
-      <w:r>
-        <w:rPr/>
-        <w:t xml:space="preserve">Counts coded extracts per section and subsection, not participants.</w:t>
-      </w:r>
-    </w:p>
-    <w:p>
-      <w:pPr>
-        <w:pStyle w:val="Meta"/>
-      </w:pPr>
-      <w:r>
-        <w:rPr/>
-        <w:t xml:space="preserve">Unchanged original · continuous view 3 of 5. Complete SVG, PDF and PNG are in the report ZIP.</w:t>
-      </w:r>
-    </w:p>
-    <w:p>
-      <w:pPr>
-        <w:pStyle w:val="Heading2"/>
-        <w:pageBreakBefore/>
-      </w:pPr>
-      <w:r>
-        <w:rPr/>
-        <w:t xml:space="preserve">Figure 4 · view 4 of 5</w:t>
-      </w:r>
-    </w:p>
-    <w:p>
-      <w:pPr>
-        <w:spacing w:before="0" w:after="120" w:line="240" w:lineRule="auto"/>
-        <w:jc w:val="center"/>
-        <w:keepLines/>
-        <w:keepNext/>
-      </w:pPr>
-      <w:r>
-        <w:drawing>
-          <wp:inline>
-            <wp:extent cx="6126480" cy="5451696"/>
-            <wp:docPr id="4004" name="Themes and named subthemes" descr="Themes and named subthemes"/>
-            <a:graphic>
-              <a:graphicData uri="http://schemas.openxmlformats.org/drawingml/2006/picture">
-                <pic:pic>
-                  <pic:nvPicPr>
-                    <pic:cNvPr id="4004" name="image3a4b897638fff480327fd049.png"/>
-                    <pic:cNvPicPr/>
-                  </pic:nvPicPr>
-                  <pic:blipFill>
-                    <a:blip r:embed="image3a4b897638fff480327fd049"/>
-                    <a:srcRect t="60055" b="19881"/>
-                    <a:stretch>
-                      <a:fillRect/>
-                    </a:stretch>
-                  </pic:blipFill>
-                  <pic:spPr>
-                    <a:xfrm>
-                      <a:off x="0" y="0"/>
-                      <a:ext cx="6126480" cy="5451696"/>
-                    </a:xfrm>
-                    <a:prstGeom prst="rect">
-                      <a:avLst/>
-                    </a:prstGeom>
-                  </pic:spPr>
-                </pic:pic>
-              </a:graphicData>
-            </a:graphic>
-          </wp:inline>
-        </w:drawing>
-      </w:r>
-    </w:p>
-    <w:p>
-      <w:pPr>
-        <w:pStyle w:val="FigureCaption"/>
-        <w:keepNext/>
-      </w:pPr>
-      <w:r>
-        <w:rPr/>
-      </w:r>
-      <w:r>
-        <w:rPr>
-          <w:b/>
-        </w:rPr>
-        <w:t xml:space="preserve">Themes and named subthemes. </w:t>
-      </w:r>
-      <w:r>
-        <w:rPr/>
-        <w:t xml:space="preserve">Theme hierarchy from the original saved coding record.</w:t>
-      </w:r>
-    </w:p>
-    <w:p>
-      <w:pPr>
-        <w:pStyle w:val="Meta"/>
-      </w:pPr>
-      <w:r>
-        <w:rPr/>
-        <w:t xml:space="preserve">Counts coded extracts per section and subsection, not participants.</w:t>
-      </w:r>
-    </w:p>
-    <w:p>
-      <w:pPr>
-        <w:pStyle w:val="Meta"/>
-      </w:pPr>
-      <w:r>
-        <w:rPr/>
-        <w:t xml:space="preserve">Unchanged original · continuous view 4 of 5. Complete SVG, PDF and PNG are in the report ZIP.</w:t>
-      </w:r>
-    </w:p>
-    <w:p>
-      <w:pPr>
-        <w:pStyle w:val="Heading2"/>
-        <w:pageBreakBefore/>
-      </w:pPr>
-      <w:r>
-        <w:rPr/>
-        <w:t xml:space="preserve">Figure 4 · view 5 of 5</w:t>
-      </w:r>
-    </w:p>
-    <w:p>
-      <w:pPr>
-        <w:spacing w:before="0" w:after="120" w:line="240" w:lineRule="auto"/>
-        <w:jc w:val="center"/>
-        <w:keepLines/>
-        <w:keepNext/>
-      </w:pPr>
-      <w:r>
-        <w:drawing>
-          <wp:inline>
-            <wp:extent cx="6126480" cy="5401972"/>
-            <wp:docPr id="4005" name="Themes and named subthemes" descr="Themes and named subthemes"/>
-            <a:graphic>
-              <a:graphicData uri="http://schemas.openxmlformats.org/drawingml/2006/picture">
-                <pic:pic>
-                  <pic:nvPicPr>
-                    <pic:cNvPr id="4005" name="image3a4b897638fff480327fd049.png"/>
-                    <pic:cNvPicPr/>
-                  </pic:nvPicPr>
-                  <pic:blipFill>
-                    <a:blip r:embed="image3a4b897638fff480327fd049"/>
-                    <a:srcRect t="80119" b="0"/>
-                    <a:stretch>
-                      <a:fillRect/>
-                    </a:stretch>
-                  </pic:blipFill>
-                  <pic:spPr>
-                    <a:xfrm>
-                      <a:off x="0" y="0"/>
-                      <a:ext cx="6126480" cy="5401972"/>
-                    </a:xfrm>
-                    <a:prstGeom prst="rect">
-                      <a:avLst/>
-                    </a:prstGeom>
-                  </pic:spPr>
-                </pic:pic>
-              </a:graphicData>
-            </a:graphic>
-          </wp:inline>
-        </w:drawing>
-      </w:r>
-    </w:p>
-    <w:p>
-      <w:pPr>
-        <w:pStyle w:val="FigureCaption"/>
-        <w:keepNext/>
-      </w:pPr>
-      <w:r>
-        <w:rPr/>
-      </w:r>
-      <w:r>
-        <w:rPr>
-          <w:b/>
-        </w:rPr>
-        <w:t xml:space="preserve">Themes and named subthemes. </w:t>
-      </w:r>
-      <w:r>
-        <w:rPr/>
-        <w:t xml:space="preserve">Theme hierarchy from the original saved coding record.</w:t>
-      </w:r>
-    </w:p>
-    <w:p>
-      <w:pPr>
-        <w:pStyle w:val="Meta"/>
-      </w:pPr>
-      <w:r>
-        <w:rPr/>
-        <w:t xml:space="preserve">Counts coded extracts per section and subsection, not participants.</w:t>
-      </w:r>
-    </w:p>
-    <w:p>
-      <w:pPr>
-        <w:pStyle w:val="Meta"/>
-      </w:pPr>
-      <w:r>
-        <w:rPr/>
-        <w:t xml:space="preserve">Unchanged original · continuous view 5 of 5. Complete SVG, PDF and PNG are in the report ZIP.</w:t>
       </w:r>
     </w:p>
     <w:p>
@@ -1704,11 +1338,11 @@
               <a:graphicData uri="http://schemas.openxmlformats.org/drawingml/2006/picture">
                 <pic:pic>
                   <pic:nvPicPr>
-                    <pic:cNvPr id="5001" name="image9bb0851eddee6d552dfc2d0d.png"/>
+                    <pic:cNvPr id="5001" name="imagea09a752d3b5c52e1d52688fe.png"/>
                     <pic:cNvPicPr/>
                   </pic:nvPicPr>
                   <pic:blipFill>
-                    <a:blip r:embed="image9bb0851eddee6d552dfc2d0d"/>
+                    <a:blip r:embed="imagea09a752d3b5c52e1d52688fe"/>
                     <a:stretch>
                       <a:fillRect/>
                     </a:stretch>
@@ -1745,7 +1379,7 @@
       </w:r>
       <w:r>
         <w:rPr/>
-        <w:t xml:space="preserve">Code accumulation from the original saved coding record.</w:t>
+        <w:t xml:space="preserve">Code accumulation from the English translation teaching subset.</w:t>
       </w:r>
     </w:p>
     <w:p>
@@ -1782,7 +1416,7 @@
       </w:pPr>
       <w:r>
         <w:rPr/>
-        <w:t xml:space="preserve">E1 interview02.txt</w:t>
+        <w:t xml:space="preserve">E1 interview02-english-excerpts.txt</w:t>
       </w:r>
     </w:p>
     <w:p>
@@ -1792,16 +1426,16 @@
       </w:pPr>
       <w:r>
         <w:rPr/>
-        <w:t xml:space="preserve">Quindi noi abbiamo lavorato, per passare al metodo, sulla stampa diciamo su due stampe, </w:t>
-      </w:r>
-    </w:p>
-    <w:p>
-      <w:pPr>
-        <w:pStyle w:val="Meta"/>
-      </w:pPr>
-      <w:r>
-        <w:rPr/>
-        <w:t xml:space="preserve">interview02.txt · [872, 960)</w:t>
+        <w:t xml:space="preserve">This is [something new] compared with when I began this kind of research. Fifteen years ago I would of course have had to go to the library. Now one edition has been digitised by Google Books, while for the 1502 edition we used the digitised print from the Bavarian State Library in Munich, which is an exceptional repository of early printed books. Seventy per cent of what we look for among incunabula, late-fifteenth-century printed books and sixteenth-century editions can be found there.</w:t>
+      </w:r>
+    </w:p>
+    <w:p>
+      <w:pPr>
+        <w:pStyle w:val="Meta"/>
+      </w:pPr>
+      <w:r>
+        <w:rPr/>
+        <w:t xml:space="preserve">interview02-english-excerpts.txt · [402, 894)</w:t>
       </w:r>
     </w:p>
     <w:p>
@@ -1810,7 +1444,7 @@
       </w:pPr>
       <w:r>
         <w:rPr/>
-        <w:t xml:space="preserve">E2 interview02.txt</w:t>
+        <w:t xml:space="preserve">E2 interview02-english-excerpts.txt</w:t>
       </w:r>
     </w:p>
     <w:p>
@@ -1820,16 +1454,16 @@
       </w:pPr>
       <w:r>
         <w:rPr/>
-        <w:t xml:space="preserve">Questa rappresenta [una novità], rispetto a quando ho iniziato a fare ricerca di questo tipo, quindici anni fa ovviamente sarei dovuto andare in biblioteca, invece adesso una è stata digitalizzata da Google Libri e invece quella del 1502 abbiamo utilizzato la stampa digitalizzata dalla Staats Bibliotek di Monaco di Baviera, che è un repositore di stampe antiche eccezione, il 70% di quello che cerchiamo tra incunaboli e libri stampati di fine Quattrocento e cinquecentine lo si trova. </w:t>
-      </w:r>
-    </w:p>
-    <w:p>
-      <w:pPr>
-        <w:pStyle w:val="Meta"/>
-      </w:pPr>
-      <w:r>
-        <w:rPr/>
-        <w:t xml:space="preserve">interview02.txt · [2860, 3348)</w:t>
+        <w:t xml:space="preserve">So, moving on to the method, we worked on the printed text — on two printed editions, let us say.</w:t>
+      </w:r>
+    </w:p>
+    <w:p>
+      <w:pPr>
+        <w:pStyle w:val="Meta"/>
+      </w:pPr>
+      <w:r>
+        <w:rPr/>
+        <w:t xml:space="preserve">interview02-english-excerpts.txt · [0, 97)</w:t>
       </w:r>
     </w:p>
     <w:p>
@@ -1838,7 +1472,7 @@
       </w:pPr>
       <w:r>
         <w:rPr/>
-        <w:t xml:space="preserve">E3 interview02.txt</w:t>
+        <w:t xml:space="preserve">E3 interview02-english-excerpts.txt</w:t>
       </w:r>
     </w:p>
     <w:p>
@@ -1848,16 +1482,16 @@
       </w:pPr>
       <w:r>
         <w:rPr/>
-        <w:t xml:space="preserve">e a volte ci sono degli errori che vanno sanati nel testo latino o ci sono delle cose che non si comprendono. A volte ci sono delle lacune perché qualcosa è saltato nel processo di stampa, dal manoscritto alla stampa, e quindi bisogna ripristinarlo criticamente con l’aiuto di due stampe, </w:t>
-      </w:r>
-    </w:p>
-    <w:p>
-      <w:pPr>
-        <w:pStyle w:val="Meta"/>
-      </w:pPr>
-      <w:r>
-        <w:rPr/>
-        <w:t xml:space="preserve">interview02.txt · [1177, 1466)</w:t>
+        <w:t xml:space="preserve">Sometimes there are errors that need to be corrected in the Latin text, or things that are not understood. Sometimes there are gaps because something was lost during printing, in the passage from manuscript to print, and so the text has to be critically restored with the help of two printed editions.</w:t>
+      </w:r>
+    </w:p>
+    <w:p>
+      <w:pPr>
+        <w:pStyle w:val="Meta"/>
+      </w:pPr>
+      <w:r>
+        <w:rPr/>
+        <w:t xml:space="preserve">interview02-english-excerpts.txt · [99, 400)</w:t>
       </w:r>
     </w:p>
     <w:p>
@@ -1948,11 +1582,11 @@
       </w:pPr>
       <w:r>
         <w:rPr/>
-        <w:t xml:space="preserve">Report 73509d4bf968476e85b590022a2020fe</w:t>
-        <w:br/>
-        <w:t xml:space="preserve">Content SHA256 e9cbc41f4b971a70b15a0b46e0db94fad3e5b836f46840d54067af05d88cf040</w:t>
-        <w:br/>
-        <w:t xml:space="preserve">Evidence SHA256 c41fb0c1685d251ca701f358aae3975d978bae146a0c0d50b5b91365d0e26b5d</w:t>
+        <w:t xml:space="preserve">Report 970ff886243e408fa49a5e0c1b26bd4b</w:t>
+        <w:br/>
+        <w:t xml:space="preserve">Content SHA256 254609bb6f0cd7762d53719f24cd38637967a6debcff54e25039c68300ff408b</w:t>
+        <w:br/>
+        <w:t xml:space="preserve">Evidence SHA256 41dc40a938873e1710d074b85f545f008812e4865616a74f8dc4f54df8a7f3d6</w:t>
       </w:r>
     </w:p>
     <w:p>
@@ -1970,22 +1604,22 @@
       </w:pPr>
       <w:r>
         <w:rPr/>
-        <w:t xml:space="preserve">E1 · interview02.txt</w:t>
-      </w:r>
-    </w:p>
-    <w:p>
-      <w:pPr>
-        <w:pStyle w:val="Meta"/>
-      </w:pPr>
-      <w:r>
-        <w:rPr/>
-        <w:t xml:space="preserve">Annotation 488bba0accd84c94ad2f904f241ad6ae</w:t>
-        <w:br/>
-        <w:t xml:space="preserve">Document f153cc3e3f694f1ea763188d3535eebf</w:t>
-        <w:br/>
-        <w:t xml:space="preserve">SHA256 f43f005420b55b9fb7c8346d7f9e5c4c0cfb73f46bc295c8ca9c45e561734036</w:t>
-        <w:br/>
-        <w:t xml:space="preserve">Code 177098f805974bae8e589c1cb2fae553 · imported</w:t>
+        <w:t xml:space="preserve">E1 · interview02-english-excerpts.txt</w:t>
+      </w:r>
+    </w:p>
+    <w:p>
+      <w:pPr>
+        <w:pStyle w:val="Meta"/>
+      </w:pPr>
+      <w:r>
+        <w:rPr/>
+        <w:t xml:space="preserve">Annotation 385e5468906559869404264689236561</w:t>
+        <w:br/>
+        <w:t xml:space="preserve">Document 8c17e627c7d85f7c8967047bfa92531b</w:t>
+        <w:br/>
+        <w:t xml:space="preserve">SHA256 be1817ce96cd101e2ecf98b1bdcb6cdd257b98251deb502633d002e00913e46a</w:t>
+        <w:br/>
+        <w:t xml:space="preserve">Code 72b86059824e4ed5973875f0ee7ddff3 · manual</w:t>
       </w:r>
     </w:p>
     <w:p>
@@ -1994,22 +1628,22 @@
       </w:pPr>
       <w:r>
         <w:rPr/>
-        <w:t xml:space="preserve">E2 · interview02.txt</w:t>
-      </w:r>
-    </w:p>
-    <w:p>
-      <w:pPr>
-        <w:pStyle w:val="Meta"/>
-      </w:pPr>
-      <w:r>
-        <w:rPr/>
-        <w:t xml:space="preserve">Annotation 7748cde944af49b88b8255f3fa0d67e2</w:t>
-        <w:br/>
-        <w:t xml:space="preserve">Document f153cc3e3f694f1ea763188d3535eebf</w:t>
-        <w:br/>
-        <w:t xml:space="preserve">SHA256 f43f005420b55b9fb7c8346d7f9e5c4c0cfb73f46bc295c8ca9c45e561734036</w:t>
-        <w:br/>
-        <w:t xml:space="preserve">Code 72b86059824e4ed5973875f0ee7ddff3 · imported</w:t>
+        <w:t xml:space="preserve">E2 · interview02-english-excerpts.txt</w:t>
+      </w:r>
+    </w:p>
+    <w:p>
+      <w:pPr>
+        <w:pStyle w:val="Meta"/>
+      </w:pPr>
+      <w:r>
+        <w:rPr/>
+        <w:t xml:space="preserve">Annotation 3f029191a6885f0e9fdef6174d572dff</w:t>
+        <w:br/>
+        <w:t xml:space="preserve">Document 8c17e627c7d85f7c8967047bfa92531b</w:t>
+        <w:br/>
+        <w:t xml:space="preserve">SHA256 be1817ce96cd101e2ecf98b1bdcb6cdd257b98251deb502633d002e00913e46a</w:t>
+        <w:br/>
+        <w:t xml:space="preserve">Code 177098f805974bae8e589c1cb2fae553 · manual</w:t>
       </w:r>
     </w:p>
     <w:p>
@@ -2018,22 +1652,22 @@
       </w:pPr>
       <w:r>
         <w:rPr/>
-        <w:t xml:space="preserve">E3 · interview02.txt</w:t>
-      </w:r>
-    </w:p>
-    <w:p>
-      <w:pPr>
-        <w:pStyle w:val="Meta"/>
-      </w:pPr>
-      <w:r>
-        <w:rPr/>
-        <w:t xml:space="preserve">Annotation e7f3646a9d62439c803362907036227d</w:t>
-        <w:br/>
-        <w:t xml:space="preserve">Document f153cc3e3f694f1ea763188d3535eebf</w:t>
-        <w:br/>
-        <w:t xml:space="preserve">SHA256 f43f005420b55b9fb7c8346d7f9e5c4c0cfb73f46bc295c8ca9c45e561734036</w:t>
-        <w:br/>
-        <w:t xml:space="preserve">Code 6cb80dbc23ce489e8da9428666efe6a0 · imported</w:t>
+        <w:t xml:space="preserve">E3 · interview02-english-excerpts.txt</w:t>
+      </w:r>
+    </w:p>
+    <w:p>
+      <w:pPr>
+        <w:pStyle w:val="Meta"/>
+      </w:pPr>
+      <w:r>
+        <w:rPr/>
+        <w:t xml:space="preserve">Annotation 9ebf2d198c4b5376b175ec0e8a4af023</w:t>
+        <w:br/>
+        <w:t xml:space="preserve">Document 8c17e627c7d85f7c8967047bfa92531b</w:t>
+        <w:br/>
+        <w:t xml:space="preserve">SHA256 be1817ce96cd101e2ecf98b1bdcb6cdd257b98251deb502633d002e00913e46a</w:t>
+        <w:br/>
+        <w:t xml:space="preserve">Code 6cb80dbc23ce489e8da9428666efe6a0 · manual</w:t>
       </w:r>
     </w:p>
     <w:p>
@@ -2051,7 +1685,7 @@
       </w:pPr>
       <w:r>
         <w:rPr/>
-        <w:t xml:space="preserve">Asset SHA256 70f086aaabf4597e8b5cbdfe48556566d607a079fbe65a1ac48ffcad9c1f7a15</w:t>
+        <w:t xml:space="preserve">Asset SHA256 5672504a9e6bb4aada57abd22e518c201efdd158be37941dba0ed63001a262ca</w:t>
       </w:r>
     </w:p>
     <w:p>
@@ -2080,7 +1714,7 @@
       </w:pPr>
       <w:r>
         <w:rPr/>
-        <w:t xml:space="preserve">Asset SHA256 7ffcaf37ea7e8a88c181799fc063df617369c8a7899f148114c3662c463d3b39</w:t>
+        <w:t xml:space="preserve">Asset SHA256 07b090cbcd0623c9fe23da5240f1a7371d0f96a621392022c02bab515289409b</w:t>
       </w:r>
     </w:p>
     <w:p>
@@ -2109,7 +1743,7 @@
       </w:pPr>
       <w:r>
         <w:rPr/>
-        <w:t xml:space="preserve">Asset SHA256 b1226b193aabd80cc6ed641bd7fe01ac0b1ca613cb27770b1016fcffdca8b65d</w:t>
+        <w:t xml:space="preserve">Asset SHA256 06403d13c2e1e82da9251db7babecdfc4e1077785869eef7b7764f6d9d14b7fa</w:t>
       </w:r>
     </w:p>
     <w:p>
@@ -2138,7 +1772,7 @@
       </w:pPr>
       <w:r>
         <w:rPr/>
-        <w:t xml:space="preserve">Asset SHA256 607067d562d09e41c36e4794492d542124f039b9ee057465c0dc88de396a4a75</w:t>
+        <w:t xml:space="preserve">Asset SHA256 97acc32af830a1c740a2d34970dd9174684713461e00a0fd651cf3c8b25f03ab</w:t>
       </w:r>
     </w:p>
     <w:p>
@@ -2167,7 +1801,7 @@
       </w:pPr>
       <w:r>
         <w:rPr/>
-        <w:t xml:space="preserve">Asset SHA256 7ca3588b185bf8a63616c0794f7fca0ca1d3654295d486b95848697678744615</w:t>
+        <w:t xml:space="preserve">Asset SHA256 cbcb33c8e1983e9dfe40517949323d50b916607a7c8d1a067656af0b58a792d4</w:t>
       </w:r>
     </w:p>
     <w:p>
@@ -2504,9 +2138,9 @@
 </file>
 
 <file path=customXml/item1.xml><?xml version="1.0" encoding="utf-8"?>
-<report>{"bindings":{"codes":{"177098f805974bae8e589c1cb2fae553":{"id":"177098f805974bae8e589c1cb2fae553","name":"printed books and manuscripts from the Renaissance","path":"materials &gt; ancient manuscripts and early printed books &gt; printed books and manuscripts from the Renaissance"},"6cb80dbc23ce489e8da9428666efe6a0":{"id":"6cb80dbc23ce489e8da9428666efe6a0","name":"critically-reconstructed text","path":"materials &gt; publications, modern and contemporary &gt; publications stemming from the project &gt; critical editions &gt; structure of a critical edition &gt; critically-reconstructed text"},"72b86059824e4ed5973875f0ee7ddff3":{"id":"72b86059824e4ed5973875f0ee7ddff3","name":"digitisation has changed the way of working on the documents","path":"materials &gt; digital representations of cultural objects &gt; pros of using facsimiles and photographs &gt; digitisation has changed the way of working on the documents"}},"evidence":{"488bba0accd84c94ad2f904f241ad6ae":{"code_id":"177098f805974bae8e589c1cb2fae553","document_id":"f153cc3e3f694f1ea763188d3535eebf","document_name":"interview02.txt","end":960,"id":"488bba0accd84c94ad2f904f241ad6ae","quote":"Quindi noi abbiamo lavorato, per passare al metodo, sulla stampa diciamo su due stampe, ","sha256":"f43f005420b55b9fb7c8346d7f9e5c4c0cfb73f46bc295c8ca9c45e561734036","source":"imported","start":872},"7748cde944af49b88b8255f3fa0d67e2":{"code_id":"72b86059824e4ed5973875f0ee7ddff3","document_id":"f153cc3e3f694f1ea763188d3535eebf","document_name":"interview02.txt","end":3348,"id":"7748cde944af49b88b8255f3fa0d67e2","quote":"Questa rappresenta [una novità], rispetto a quando ho iniziato a fare ricerca di questo tipo, quindici anni fa ovviamente sarei dovuto andare in biblioteca, invece adesso una è stata digitalizzata da Google Libri e invece quella del 1502 abbiamo utilizzato la stampa digitalizzata dalla Staats Bibliotek di Monaco di Baviera, che è un repositore di stampe antiche eccezione, il 70% di quello che cerchiamo tra incunaboli e libri stampati di fine Quattrocento e cinquecentine lo si trova. ","sha256":"f43f005420b55b9fb7c8346d7f9e5c4c0cfb73f46bc295c8ca9c45e561734036","source":"imported","start":2860},"e7f3646a9d62439c803362907036227d":{"code_id":"6cb80dbc23ce489e8da9428666efe6a0","document_id":"f153cc3e3f694f1ea763188d3535eebf","document_name":"interview02.txt","end":1466,"id":"e7f3646a9d62439c803362907036227d","quote":"e a volte ci sono degli errori che vanno sanati nel testo latino o ci sono delle cose che non si comprendono. A volte ci sono delle lacune perché qualcosa è saltato nel processo di stampa, dal manoscritto alla stampa, e quindi bisogna ripristinarlo criticamente con l’aiuto di due stampe, ","sha256":"f43f005420b55b9fb7c8346d7f9e5c4c0cfb73f46bc295c8ca9c45e561734036","source":"imported","start":1177}},"figures":{"example-accumulation":{"asset_id":"7ca3588b185bf8a63616c0794f7fca0ca1d3654295d486b95848697678744615","source_version":"c41fb0c1685d251ca701f358aae3975d978bae146a0c0d50b5b91365d0e26b5d"},"example-cooccurrence":{"asset_id":"b1226b193aabd80cc6ed641bd7fe01ac0b1ca613cb27770b1016fcffdca8b65d","source_version":"c41fb0c1685d251ca701f358aae3975d978bae146a0c0d50b5b91365d0e26b5d"},"example-coverage":{"asset_id":"7ffcaf37ea7e8a88c181799fc063df617369c8a7899f148114c3662c463d3b39","source_version":"c41fb0c1685d251ca701f358aae3975d978bae146a0c0d50b5b91365d0e26b5d"},"example-frequency":{"asset_id":"70f086aaabf4597e8b5cbdfe48556566d607a079fbe65a1ac48ffcad9c1f7a15","source_version":"c41fb0c1685d251ca701f358aae3975d978bae146a0c0d50b5b91365d0e26b5d"},"example-hierarchy":{"asset_id":"607067d562d09e41c36e4794492d542124f039b9ee057465c0dc88de396a4a75","source_version":"c41fb0c1685d251ca701f358aae3975d978bae146a0c0d50b5b91365d0e26b5d"}}},"content_hash":"e9cbc41f4b971a70b15a0b46e0db94fad3e5b836f46840d54067af05d88cf040","draft":{"analysis_unit":"An existing quotation and its saved code path, read in the context of the full source document.","approach":"Qualitative Content Analysis","case_unit":"The corpus has 19 public interview documents. The short written example below reviews selected passages from interview02.txt.","checks":{"category-development":false,"category-review":false,"coding-rules":false,"context":false,"units":true,"writing":false},"counterexamples":"Only selected material-related passages are interpreted here. Contrasting perspectives across the other interviews require further contextual reading.","disclosure":"Public Bologna CC0 data only. No private interviews or model calls were used. Editing the downloaded Word documents does not change the QT project.","figures":[{"caption":"Code frequency from the original saved coding record.","id":"example-frequency","options":{"annotate":true,"cluster":false,"color":"#73a89a","credit":"Counts passage-code assignments, not participants. Frequency is not importance.","dpi":300,"figsize":11.0,"font":"DejaVu Sans","fontsize":10,"kind":"frequency","level":"code","method":"ward","mode":"overlap","name":"figure_frequency","palette":"YlGnBu","subtitle":"","title":"Code frequency","top":15}},{"caption":"Code by interview from the original saved coding record.","id":"example-coverage","options":{"annotate":true,"cluster":false,"color":"#73a89a","credit":"Counts passage-code assignments, not participants. Zero means no coding in this interview.","dpi":300,"figsize":11.0,"font":"DejaVu Sans","fontsize":10,"kind":"coverage","level":"code","method":"ward","mode":"overlap","name":"figure_coverage","palette":"YlGnBu","subtitle":"","title":"Code-by-interview matrix","top":15}},{"caption":"Code co-occurrence from the original saved coding record.","id":"example-cooccurrence","options":{"annotate":true,"cluster":false,"color":"#73a89a","credit":"Codes whose character ranges overlap within one interview. Descriptive; not correlation. Diagonal counts the units a code appears in, not pairs.","dpi":300,"figsize":11.0,"font":"DejaVu Sans","fontsize":10,"kind":"cooccurrence","level":"code","method":"ward","mode":"overlap","name":"figure_cooccurrence","palette":"YlGnBu","subtitle":"Descriptive only: two codes sharing a range, not a correlation.","title":"Overlapping-range co-occurrence","top":15}},{"caption":"Theme hierarchy from the original saved coding record.","id":"example-hierarchy","options":{"annotate":true,"cluster":false,"color":"#73a89a","credit":"Counts coded extracts per section and subsection, not participants.","dpi":300,"figsize":11.0,"font":"DejaVu Sans","fontsize":10,"kind":"hierarchy","level":"code","method":"ward","mode":"overlap","name":"figure_hierarchy","palette":"YlGnBu","subtitle":"","title":"Themes and named subthemes","top":15}},{"caption":"Code accumulation from the original saved coding record.","id":"example-accumulation","options":{"annotate":true,"cluster":false,"color":"#73a89a","credit":"Interviews in file-name order, not the order conducted. A plateau is not saturation.","dpi":300,"figsize":11.0,"font":"DejaVu Sans","fontsize":10,"kind":"accumulation","level":"code","method":"ward","mode":"overlap","name":"figure_accumulation","palette":"YlGnBu","subtitle":"","title":"Code accumulation curve","top":15}}],"limitations":"This small writing example does not establish a complete analysis or saturation. Counts describe saved coding activity rather than importance or prevalence among people.","method":"content","method_notes":"This is a worked software example using the original Bologna coding. No new coding or participant interpretation was generated. Table labels retain the saved ancestry. Method steps show the workflow; unchecked review stages remain unconfirmed.","narrative":"The selected passages describe different forms of research material. Their saved paths place these distinctions inside the materials group. Read the exact quotations before judging how well each code fits. [E:488bba0accd84c94ad2f904f241ad6ae] [E:e7f3646a9d62439c803362907036227d] [E:7748cde944af49b88b8255f3fa0d67e2]\nThe five figures summarize all existing codings across the corpus. They support checking the record; they do not substitute for interpretation of the interviews.","quality_notes":"Quoted characters and code identities were checked against the saved source. All five figures use the complete original 19-document coding record and their existing counting rules.","reflexivity":"The short illustrative narrative was prepared for the QT demonstration. It is not an independently validated analysis of this corpus.","research_question":"How are research materials described in this saved Bologna coding record?","rows":[{"category":"ancient manuscripts and early printed books","code_ids":["177098f805974bae8e589c1cb2fae553"],"evidence_ids":["488bba0accd84c94ad2f904f241ad6ae"],"id":"example-row-1","interpretation":"The saved code distinguishes a form of research material in this passage. [E:488bba0accd84c94ad2f904f241ad6ae]","theme":"materials"},{"category":"publications, modern and contemporary &gt; publications stemming from the project &gt; critical editions &gt; structure of a critical edition","code_ids":["6cb80dbc23ce489e8da9428666efe6a0"],"evidence_ids":["e7f3646a9d62439c803362907036227d"],"id":"example-row-2","interpretation":"The saved code distinguishes a form of research material in this passage. [E:e7f3646a9d62439c803362907036227d]","theme":"materials"},{"category":"digital representations of cultural objects &gt; pros of using facsimiles and photographs","code_ids":["72b86059824e4ed5973875f0ee7ddff3"],"evidence_ids":["7748cde944af49b88b8255f3fa0d67e2"],"id":"example-row-3","interpretation":"The saved code distinguishes a form of research material in this passage. [E:7748cde944af49b88b8255f3fa0d67e2]","theme":"materials"}],"title":"Bologna coding evidence report"},"id":"73509d4bf968476e85b590022a2020fe","method_map":{"links":[[1,2],[2,3],[3,4],[4,5],[5,6],[5,2]],"method":"content","name":"Qualitative Content Analysis","note":"Content analysis is a complete method. It is not a compulsory preliminary stage for TA or Comparative QCA.","references":[{"title":"Graneheim and Lundman (2004) · concepts and procedures","url":"https://doi.org/10.1016/j.nedt.2003.10.001"}],"steps":[{"detail":"Document what is analysed and the chosen content analysis approach.","id":1,"title":"Declare unit and approach"},{"detail":"Identify relevant passages while retaining their surrounding context.","id":2,"title":"Select meaning units"},{"detail":"Shorten meaning units only when this fits the analytic design.","id":3,"title":"Condense when appropriate"},{"detail":"Compare codes and refine categories with explicit analytic decisions.","id":4,"title":"Code and review categories"},{"detail":"Consider meaning and abstraction; themes are optional, design-dependent.","id":5,"title":"Interpret in context"},{"detail":"Connect categories, interpretation and source quotations in the report.","id":6,"title":"Write with evidence"}],"version":1},"restored_from":null,"revision":2,"saved_at":"2026-10-18T17:38:23.221279+00:00","source_version":"c41fb0c1685d251ca701f358aae3975d978bae146a0c0d50b5b91365d0e26b5d"}</report>
+<report>{"bindings":{"codes":{"177098f805974bae8e589c1cb2fae553":{"id":"177098f805974bae8e589c1cb2fae553","name":"printed books and manuscripts from the Renaissance","path":"materials &gt; ancient manuscripts and early printed books &gt; printed books and manuscripts from the Renaissance"},"6cb80dbc23ce489e8da9428666efe6a0":{"id":"6cb80dbc23ce489e8da9428666efe6a0","name":"critically-reconstructed text","path":"materials &gt; publications, modern and contemporary &gt; publications stemming from the project &gt; critical editions &gt; structure of a critical edition &gt; critically-reconstructed text"},"72b86059824e4ed5973875f0ee7ddff3":{"id":"72b86059824e4ed5973875f0ee7ddff3","name":"digitisation has changed the way of working on the documents","path":"materials &gt; digital representations of cultural objects &gt; pros of using facsimiles and photographs &gt; digitisation has changed the way of working on the documents"}},"evidence":{"385e5468906559869404264689236561":{"code_id":"72b86059824e4ed5973875f0ee7ddff3","document_id":"8c17e627c7d85f7c8967047bfa92531b","document_name":"interview02-english-excerpts.txt","end":894,"id":"385e5468906559869404264689236561","quote":"This is [something new] compared with when I began this kind of research. Fifteen years ago I would of course have had to go to the library. Now one edition has been digitised by Google Books, while for the 1502 edition we used the digitised print from the Bavarian State Library in Munich, which is an exceptional repository of early printed books. Seventy per cent of what we look for among incunabula, late-fifteenth-century printed books and sixteenth-century editions can be found there.","sha256":"be1817ce96cd101e2ecf98b1bdcb6cdd257b98251deb502633d002e00913e46a","source":"manual","start":402},"3f029191a6885f0e9fdef6174d572dff":{"code_id":"177098f805974bae8e589c1cb2fae553","document_id":"8c17e627c7d85f7c8967047bfa92531b","document_name":"interview02-english-excerpts.txt","end":97,"id":"3f029191a6885f0e9fdef6174d572dff","quote":"So, moving on to the method, we worked on the printed text — on two printed editions, let us say.","sha256":"be1817ce96cd101e2ecf98b1bdcb6cdd257b98251deb502633d002e00913e46a","source":"manual","start":0},"9ebf2d198c4b5376b175ec0e8a4af023":{"code_id":"6cb80dbc23ce489e8da9428666efe6a0","document_id":"8c17e627c7d85f7c8967047bfa92531b","document_name":"interview02-english-excerpts.txt","end":400,"id":"9ebf2d198c4b5376b175ec0e8a4af023","quote":"Sometimes there are errors that need to be corrected in the Latin text, or things that are not understood. Sometimes there are gaps because something was lost during printing, in the passage from manuscript to print, and so the text has to be critically restored with the help of two printed editions.","sha256":"be1817ce96cd101e2ecf98b1bdcb6cdd257b98251deb502633d002e00913e46a","source":"manual","start":99}},"figures":{"example-accumulation":{"asset_id":"cbcb33c8e1983e9dfe40517949323d50b916607a7c8d1a067656af0b58a792d4","source_version":"41dc40a938873e1710d074b85f545f008812e4865616a74f8dc4f54df8a7f3d6"},"example-cooccurrence":{"asset_id":"06403d13c2e1e82da9251db7babecdfc4e1077785869eef7b7764f6d9d14b7fa","source_version":"41dc40a938873e1710d074b85f545f008812e4865616a74f8dc4f54df8a7f3d6"},"example-coverage":{"asset_id":"07b090cbcd0623c9fe23da5240f1a7371d0f96a621392022c02bab515289409b","source_version":"41dc40a938873e1710d074b85f545f008812e4865616a74f8dc4f54df8a7f3d6"},"example-frequency":{"asset_id":"5672504a9e6bb4aada57abd22e518c201efdd158be37941dba0ed63001a262ca","source_version":"41dc40a938873e1710d074b85f545f008812e4865616a74f8dc4f54df8a7f3d6"},"example-hierarchy":{"asset_id":"97acc32af830a1c740a2d34970dd9174684713461e00a0fd651cf3c8b25f03ab","source_version":"41dc40a938873e1710d074b85f545f008812e4865616a74f8dc4f54df8a7f3d6"}}},"content_hash":"254609bb6f0cd7762d53719f24cd38637967a6debcff54e25039c68300ff408b","draft":{"analysis_unit":"An existing quotation and its saved code path, read in the context of the full source document.","approach":"Qualitative Content Analysis","case_unit":"This English teaching subset contains selected translated passages from three public Bologna interviews. The Notebook covers all excerpts selected from interview02.txt, not the full original interview.","checks":{"category-development":false,"category-review":false,"coding-rules":false,"context":false,"units":true,"writing":false},"counterexamples":"Only selected material-related passages are interpreted here. Contrasting perspectives across the other interviews require further contextual reading.","disclosure":"Public Bologna CC0 data only. No private interviews or model calls were used. Editing the downloaded Word documents does not change the QT project.","figures":[{"caption":"Code frequency from the English translation teaching subset.","id":"example-frequency","options":{"annotate":true,"cluster":false,"color":"#73a89a","credit":"Counts passage-code assignments, not participants. Frequency is not importance.","dpi":300,"figsize":11.0,"font":"DejaVu Sans","fontsize":10,"kind":"frequency","level":"code","method":"ward","mode":"overlap","name":"figure_frequency","palette":"YlGnBu","subtitle":"","title":"Code frequency","top":15}},{"caption":"Code by interview from the English translation teaching subset.","id":"example-coverage","options":{"annotate":true,"cluster":false,"color":"#73a89a","credit":"Counts passage-code assignments, not participants. Zero means no coding in this interview.","dpi":300,"figsize":11.0,"font":"DejaVu Sans","fontsize":10,"kind":"coverage","level":"code","method":"ward","mode":"overlap","name":"figure_coverage","palette":"YlGnBu","subtitle":"","title":"Code-by-interview matrix","top":15}},{"caption":"Code co-occurrence from the English translation teaching subset.","id":"example-cooccurrence","options":{"annotate":true,"cluster":false,"color":"#73a89a","credit":"Codes whose character ranges overlap within one interview. Descriptive; not correlation. Diagonal counts the units a code appears in, not pairs.","dpi":300,"figsize":11.0,"font":"DejaVu Sans","fontsize":10,"kind":"cooccurrence","level":"code","method":"ward","mode":"overlap","name":"figure_cooccurrence","palette":"YlGnBu","subtitle":"Descriptive only: two codes sharing a range, not a correlation.","title":"Overlapping-range co-occurrence","top":15}},{"caption":"Theme hierarchy from the English translation teaching subset.","id":"example-hierarchy","options":{"annotate":true,"cluster":false,"color":"#73a89a","credit":"Counts coded extracts per section and subsection, not participants.","dpi":300,"figsize":11.0,"font":"DejaVu Sans","fontsize":10,"kind":"hierarchy","level":"code","method":"ward","mode":"overlap","name":"figure_hierarchy","palette":"YlGnBu","subtitle":"","title":"Themes and named subthemes","top":15}},{"caption":"Code accumulation from the English translation teaching subset.","id":"example-accumulation","options":{"annotate":true,"cluster":false,"color":"#73a89a","credit":"Interviews in file-name order, not the order conducted. A plateau is not saturation.","dpi":300,"figsize":11.0,"font":"DejaVu Sans","fontsize":10,"kind":"accumulation","level":"code","method":"ward","mode":"overlap","name":"figure_accumulation","palette":"YlGnBu","subtitle":"","title":"Code accumulation curve","top":15}}],"limitations":"This small writing example does not establish a complete analysis or saturation. Counts describe saved coding activity rather than importance or prevalence among people.","method":"content","method_notes":"This is a worked software example using translated Bologna excerpts and source-linked teaching associations. Translated offsets refer to the English teaching documents, not the Italian originals. This is not a new empirical analysis. Table labels retain the saved ancestry. Method steps show the workflow; unchecked review stages remain unconfirmed.","narrative":"The selected passages describe different forms of research material. Their saved paths place these distinctions inside the materials group. Read the exact quotations before judging how well each code fits. [E:3f029191a6885f0e9fdef6174d572dff] [E:9ebf2d198c4b5376b175ec0e8a4af023] [E:385e5468906559869404264689236561]\nThe five figures summarize all existing codings across the corpus. They support checking the record; they do not substitute for interpretation of the interviews.","quality_notes":"Quoted characters and code identities were checked against the saved source. All five figures use only this three-document translated teaching subset and the unchanged counting rules.","reflexivity":"The short illustrative narrative was prepared for the QT demonstration. It is not an independently validated analysis of this corpus.","research_question":"How are research materials described in this saved Bologna coding record?","rows":[{"category":"ancient manuscripts and early printed books","code_ids":["177098f805974bae8e589c1cb2fae553"],"evidence_ids":["3f029191a6885f0e9fdef6174d572dff"],"id":"example-row-1","interpretation":"The saved code distinguishes a form of research material in this passage. [E:3f029191a6885f0e9fdef6174d572dff]","theme":"materials"},{"category":"publications, modern and contemporary &gt; publications stemming from the project &gt; critical editions &gt; structure of a critical edition","code_ids":["6cb80dbc23ce489e8da9428666efe6a0"],"evidence_ids":["9ebf2d198c4b5376b175ec0e8a4af023"],"id":"example-row-2","interpretation":"The saved code distinguishes a form of research material in this passage. [E:9ebf2d198c4b5376b175ec0e8a4af023]","theme":"materials"},{"category":"digital representations of cultural objects &gt; pros of using facsimiles and photographs","code_ids":["72b86059824e4ed5973875f0ee7ddff3"],"evidence_ids":["385e5468906559869404264689236561"],"id":"example-row-3","interpretation":"The saved code distinguishes a form of research material in this passage. [E:385e5468906559869404264689236561]","theme":"materials"}],"title":"Bologna coding evidence report"},"id":"970ff886243e408fa49a5e0c1b26bd4b","method_map":{"links":[[1,2],[2,3],[3,4],[4,5],[5,6],[5,2]],"method":"content","name":"Qualitative Content Analysis","note":"Content analysis is a complete method. It is not a compulsory preliminary stage for TA or Comparative QCA.","references":[{"title":"Graneheim and Lundman (2004) · concepts and procedures","url":"https://doi.org/10.1016/j.nedt.2003.10.001"}],"steps":[{"detail":"Document what is analysed and the chosen content analysis approach.","id":1,"title":"Declare unit and approach"},{"detail":"Identify relevant passages while retaining their surrounding context.","id":2,"title":"Select meaning units"},{"detail":"Shorten meaning units only when this fits the analytic design.","id":3,"title":"Condense when appropriate"},{"detail":"Compare codes and refine categories with explicit analytic decisions.","id":4,"title":"Code and review categories"},{"detail":"Consider meaning and abstraction; themes are optional, design-dependent.","id":5,"title":"Interpret in context"},{"detail":"Connect categories, interpretation and source quotations in the report.","id":6,"title":"Write with evidence"}],"version":1},"restored_from":null,"revision":1,"saved_at":"2026-10-20T20:56:15.602261+00:00","source_version":"41dc40a938873e1710d074b85f545f008812e4865616a74f8dc4f54df8a7f3d6"}</report>
 </file>
 
 <file path=customXml/item2.xml><?xml version="1.0" encoding="utf-8"?>
-<figure-records>{"example-accumulation":{"binding":{"asset_id":"7ca3588b185bf8a63616c0794f7fca0ca1d3654295d486b95848697678744615","source_version":"c41fb0c1685d251ca701f358aae3975d978bae146a0c0d50b5b91365d0e26b5d"},"environment":{"font":"DejaVu Sans","matplotlib":"3.11.2","python":"3.14.6","scipy":"not installed"},"members":{"figure.py":"f580d665b60f70c6207bd7e44a5be6c187c71af21a7d98906958a7972edc09f8","figure_accumulation.pdf":"20acbaef94e4248e5c2aa92fa371163cd07dd4ace4a2a0bb9d94385fbe9470a5","figure_accumulation.png":"9bb0851eddee6d552dfc2d0d6c875bad35b684ff945df3e4f8b3bb48cdb4433d","figure_accumulation.svg":"99a7e0a84016ab39e818ae8f5a9df4134c45592e409d276cf4f593d88125848f","figure_data.csv":"bc3a3a07462ad2d98540f9e720049fa4bc4016a92ad991245600d239c96756b5"},"options":{"annotate":true,"cluster":false,"color":"#73a89a","credit":"Interviews in file-name order, not the order conducted. A plateau is not saturation.","dpi":300,"figsize":11.0,"font":"DejaVu Sans","fontsize":10,"kind":"accumulation","level":"code","method":"ward","mode":"overlap","name":"figure_accumulation","palette":"YlGnBu","subtitle":"","title":"Code accumulation curve","top":15},"result":{"cases":["interview01.txt","interview02.txt","interview03.txt","interview04.txt","interview05.txt","interview06.txt","interview07.txt","interview08.txt","interview09.txt","interview10.txt","interview11.txt","interview12.txt","interview13.txt","interview14.txt","interview15.txt","interview16.txt","interview17.txt","interview18.txt","interview19.txt"],"codings":874,"cumulative":[24,58,90,108,117,137,144,165,179,191,198,205,214,225,236,246,250,251,259],"kind":"accumulation"}},"example-cooccurrence":{"binding":{"asset_id":"b1226b193aabd80cc6ed641bd7fe01ac0b1ca613cb27770b1016fcffdca8b65d","source_version":"c41fb0c1685d251ca701f358aae3975d978bae146a0c0d50b5b91365d0e26b5d"},"environment":{"font":"DejaVu Sans","matplotlib":"3.11.2","python":"3.14.6","scipy":"not installed"},"members":{"figure.py":"46b85d5dbab8c35b1eac39a30c4ac135691d5261ff650ce5f9ed84c5273dcd68","figure_cooccurrence.pdf":"ebe32cd2c21cf2790c54d5e2b8ec2a6b8a0401df5383b90e9ad481326acd1b7a","figure_cooccurrence.png":"9e0854f89c534e3ad137b9e6070d754c59945113fe9f6e1e62927442e73b8754","figure_cooccurrence.svg":"f594d3e5c68c0d84d3de9e9b968555fc87ba973a9098e3688a9e607db8aef203","figure_data.csv":"0dd2521d8b1c8e7d7339b1b0e70ff25c8e8d337e401bec64e28e98f84de989fc"},"options":{"annotate":true,"cluster":false,"color":"#73a89a","credit":"Codes whose character ranges overlap within one interview. Descriptive; not correlation. Diagonal counts the units a code appears in, not pairs.","dpi":300,"figsize":11.0,"font":"DejaVu Sans","fontsize":10,"kind":"cooccurrence","level":"code","method":"ward","mode":"overlap","name":"figure_cooccurrence","palette":"YlGnBu","subtitle":"Descriptive only: two codes sharing a range, not a correlation.","title":"Overlapping-range co-occurrence","top":15},"result":{"codings":874,"kind":"cooccurrence","labels":["keeping working materials after the end of the project","working with others as part of a team","preceding academic work on the same subject","specificities of the humanities","primary sources are data","published with traditional academic publishers","interpretation and results are data","working with others through consultations","digitisation has changed the way of working on the documents","critical editions are deeply formalized","data are circunscribed and objective","discarded material can be useful for teaching and further research","conferences and workshops","journal articles","methodologies are formalized in manuals"],"matrix":[[23,0,0,0,0,0,0,0,0,0,0,7,0,0,0],[0,21,2,0,0,0,0,0,0,0,0,0,1,0,0],[0,2,19,0,0,0,0,0,0,0,0,0,0,0,0],[0,0,0,17,0,0,0,0,0,0,0,0,1,0,0],[0,0,0,0,15,0,2,0,0,0,1,0,0,0,0],[0,0,0,0,0,15,0,0,0,0,0,0,0,0,0],[0,0,0,0,2,0,13,0,0,0,0,0,0,0,0],[0,0,0,0,0,0,0,13,0,0,0,0,0,0,0],[0,0,0,0,0,0,0,0,11,0,0,0,0,0,0],[0,0,0,0,0,0,0,0,0,10,0,0,0,0,1],[0,0,0,0,1,0,0,0,0,0,10,0,0,0,0],[7,0,0,0,0,0,0,0,0,0,0,10,0,0,0],[0,1,0,1,0,0,0,0,0,0,0,0,9,1,0],[0,0,0,0,0,0,0,0,0,0,0,0,1,9,0],[0,0,0,0,0,0,0,0,0,1,0,0,0,0,9]],"mode":"overlap"}},"example-coverage":{"binding":{"asset_id":"7ffcaf37ea7e8a88c181799fc063df617369c8a7899f148114c3662c463d3b39","source_version":"c41fb0c1685d251ca701f358aae3975d978bae146a0c0d50b5b91365d0e26b5d"},"environment":{"font":"DejaVu Sans","matplotlib":"3.11.2","python":"3.14.6","scipy":"not installed"},"members":{"figure.py":"ada773385d5c1c9dafba4dc7dc64b597a8100c07b29916d77655f1ab9bd235f1","figure_coverage.pdf":"7cde708b4d89c4fd8fdf277f437b580d2011b790a86e2df99e23b0ff2b7e4498","figure_coverage.png":"236d1bb6754b5bc36f61349f3b95920e1f07379af54d64667abf02b43eba7351","figure_coverage.svg":"9ec96f66772a3a7490f55905e072f0d3dbd355a1d81c70199cab275f2530686c","figure_data.csv":"25b9b3c04d981db6e61c34184b3d11265cb95f8b742332abef2de27f6b57653b"},"options":{"annotate":true,"cluster":false,"color":"#73a89a","credit":"Counts passage-code assignments, not participants. Zero means no coding in this interview.","dpi":300,"figsize":11.0,"font":"DejaVu Sans","fontsize":10,"kind":"coverage","level":"code","method":"ward","mode":"overlap","name":"figure_coverage","palette":"YlGnBu","subtitle":"","title":"Code-by-interview matrix","top":15},"result":{"cases":["interview01.txt","interview02.txt","interview03.txt","interview04.txt","interview05.txt","interview06.txt","interview07.txt","interview08.txt","interview09.txt","interview10.txt","interview11.txt","interview12.txt","interview13.txt","interview14.txt","interview15.txt","interview16.txt","interview17.txt","interview18.txt","interview19.txt"],"codings":874,"kind":"coverage","labels":["keeping working materials after the end of the project","working with others as part of a team","preceding academic work on the same subject","specificities of the humanities","primary sources are data","published with traditional academic publishers","interpretation and results are data","working with others through consultations","digitisation has changed the way of working on the documents","critical editions are deeply formalized","data are circunscribed and objective","discarded material can be useful for teaching and further research","conferences and workshops","journal articles","methodologies are formalized in manuals"],"matrix":[[0,1,5,0,2,0,1,0,0,0,0,0,0,0,0],[1,2,0,0,1,4,1,0,2,0,1,1,0,0,0],[2,3,0,4,0,1,0,0,3,2,1,0,0,0,0],[1,2,0,0,2,2,2,0,3,1,0,2,0,0,0],[2,0,2,0,0,0,0,2,0,3,0,0,0,0,1],[1,2,1,0,0,2,0,0,0,0,1,0,0,1,1],[1,3,1,0,0,1,0,1,0,2,1,0,2,1,1],[1,1,0,0,0,0,0,0,0,0,1,0,1,2,0],[2,0,1,3,1,0,4,1,0,2,0,1,1,0,0],[1,0,2,4,0,3,1,3,0,0,0,1,0,0,1],[1,0,2,0,0,1,0,1,0,0,0,1,0,0,0],[2,3,0,1,2,1,0,1,1,0,2,0,0,0,2],[2,0,2,2,0,0,0,0,0,0,1,2,1,1,0],[1,1,0,2,0,0,0,0,0,0,0,1,0,0,0],[1,0,1,0,2,0,0,1,0,0,1,0,0,0,0],[1,0,1,0,1,0,0,0,0,0,1,0,0,1,1],[1,1,0,1,1,0,1,1,1,0,0,0,1,0,0],[1,1,1,0,1,0,1,1,0,0,0,0,1,2,1],[1,1,0,0,2,0,2,1,1,0,0,1,2,1,1]]}},"example-frequency":{"binding":{"asset_id":"70f086aaabf4597e8b5cbdfe48556566d607a079fbe65a1ac48ffcad9c1f7a15","source_version":"c41fb0c1685d251ca701f358aae3975d978bae146a0c0d50b5b91365d0e26b5d"},"environment":{"font":"DejaVu Sans","matplotlib":"3.11.2","python":"3.14.6","scipy":"not installed"},"members":{"figure.py":"cb9d0a4ace383338ab042e77788b7bc3a73bb564ef5368b8a8221a23ff1ef7ed","figure_data.csv":"958c9bbd833ad2228230f0927bc09a35cd78824571328b03e572a439152cd82c","figure_frequency.pdf":"3b05f640e3fb8d09a3d4018485e2fc1d4573ecb58486d0f23b0bf81953bb2551","figure_frequency.png":"ec03e8690f56e2901daa6d5088874071dfacdda78387a35dab1434ffb1d34dd7","figure_frequency.svg":"56e04b1064f96f80f703be177a6b69569b65f2dba12765f8540c3c393ad01046"},"options":{"annotate":true,"cluster":false,"color":"#73a89a","credit":"Counts passage-code assignments, not participants. Frequency is not importance.","dpi":300,"figsize":11.0,"font":"DejaVu Sans","fontsize":10,"kind":"frequency","level":"code","method":"ward","mode":"overlap","name":"figure_frequency","palette":"YlGnBu","subtitle":"","title":"Code frequency","top":15},"result":{"codings":874,"counts":[23,21,19,17,15,15,13,13,11,10,10,10,9,9,9],"kind":"frequency","labels":["keeping working materials after the end of the project","working with others as part of a team","preceding academic work on the same subject","specificities of the humanities","primary sources are data","published with traditional academic publishers","interpretation and results are data","working with others through consultations","digitisation has changed the way of working on the documents","critical editions are deeply formalized","data are circunscribed and objective","discarded material can be useful for teaching and further research","conferences and workshops","journal articles","methodologies are formalized in manuals"],"level":"code"}},"example-hierarchy":{"binding":{"asset_id":"607067d562d09e41c36e4794492d542124f039b9ee057465c0dc88de396a4a75","source_version":"c41fb0c1685d251ca701f358aae3975d978bae146a0c0d50b5b91365d0e26b5d"},"environment":{"font":"DejaVu Sans","matplotlib":"3.11.2","python":"3.14.6","scipy":"not installed"},"members":{"figure.py":"4b258b83cf7a0f04b41a611008b8dc38ef94e9cb6904e35d58b171510b73fa9c","figure_data.csv":"f073aa8760a9866a876bc4d4435aed6bb626393050e9eca5cdefbd1e255e6e10","figure_hierarchy.pdf":"2754571b6b0af8cafc1fce56a2f83aa5a69bd5dc0ab977882e26e9fcc87be380","figure_hierarchy.png":"3a4b897638fff480327fd0494e8ad0280708ad12a3a744239c3c4682fb42b1f5","figure_hierarchy.svg":"328f6c8694ff8a197aa2ad2a3191b83a3cf76fa6c6fd65747f7a302d5baab358"},"options":{"annotate":true,"cluster":false,"color":"#73a89a","credit":"Counts coded extracts per section and subsection, not participants.","dpi":300,"figsize":11.0,"font":"DejaVu Sans","fontsize":10,"kind":"hierarchy","level":"code","method":"ward","mode":"overlap","name":"figure_hierarchy","palette":"YlGnBu","subtitle":"","title":"Themes and named subthemes","top":15},"result":{"codings":874,"hierarchy":{"copyright and privacy":{"a specific commission to deal with privacy and ethical issues":1,"academics do not get to keep the copyright of their work":1,"avoiding copyright problems using permalinks":1,"copyright or privacy issues only for publications after XX C":4,"different copyright and privacy laws in different countries":3,"extra work to avoid copyright issues":2,"image rights are more complicated to clear":2,"involving the Culture Ministry":2,"no copyright claims on 3D models themselves":2,"no copyright concerns regarding the app":1,"no copyright or privacy problems regarding manuscripts":6,"no privacy or copyright issues for archival documents":1,"not all partner institutions share their data (privacy concerns)":2,"open access is default for database":1,"open licences (Apache, CC)":2,"privacy and sensitive data on living people":9,"privacy course organized by Unibo useless for humanists":1,"privacy problems in cataloguing of ancient material are rare":1,"teaching materials available online are usually free to reuse":3,"when heirs are alive, authorization to publish is needed":2},"general info on projects":{"challenges faced":6,"how the project is funded":6},"is this data? and what is data?":{"changing one's mind":2,"corpora are data":4,"critically-reconstructed texts are data":2,"data I have are not that interesting":2,"data are circunscribed and objective":10,"data are difficult to define":6,"data are interesting in the context of archiving knowledge":2,"data are only digital":3,"data are quantitative":2,"data is a piece of info about the past, added to what is known":1,"data work together":5,"everything is data":3,"interpretation and results are data":13,"interpretation and results are not data":5,"materials replicated from other studies are data":2,"materials, not data":1,"methodology and notes are data":9,"methodology and notes not data":2,"perception and cognition in concept of data":3,"primary sources are data":15,"publications are data":2,"sensitive data are data":1,"software and ontologies are data":1,"term data is too generic or imprecise":5,"there is formal attention to data presentation in the humanities":1,"variants in an apparatus are data":1},"materials":{"(difficult) discussions around standards":3,"3D web viewer":1,"Bibbia copta online":1,"Gallica":1,"Google Books":1,"Incunabula Short Title Catalogue (British Library)":1,"JStor":1,"Karlsruhe Virtual Catalog":1,"Manus online":1,"Mirabile web":1,"Munich Staats Bibliotek":2,"PAThs (La Sapienza)":1,"The English Short Title Catalogue (ESTC)":2,"ancient manuscripts":2,"année philologique":1,"apparatus and other materials within a critical edition":7,"archival and bibliographic investigation on historical figure ('400-'500)":4,"archival documents often not digitized":1,"artwork images are fundamental and should be available":2,"attitudes towards digital scholarly editions":5,"back-end storing user data in RDF":3,"bibliographic databases":3,"can have a pw-protected back-end":2,"can include translation":2,"can include translation into italian":1,"cataloguing is a complex operation":1,"comments on pre-prints":2,"complexities in scanning different materials":1,"conferences and workshops":9,"conservation problems for rare documents":1,"corpora are almost always digital now":2,"corpora communicate with one another":1,"corpus of answers to socio-linguistic questionnaire":1,"creation of digital database of resources":1,"critical editions are deeply formalized":10,"critical editions are for an extremely specialized public and are not widely accessible":7,"critically-reconstructed text":6,"database are for a specialized audience":1,"database need to be \"alive\"":1,"database need to be interoperable":1,"demographic data of users":1,"digitisation has changed the way of working on the documents":11,"digitization is slow and lacking":7,"documentation: deliverables":6,"editors must declare their edition criteria":4,"essays and book chapters":5,"facsimiles allow to see inaccessible originals":2,"facsimiles are a way to preserve frail originals":1,"facsimiles help but personal inspection is still required":4,"facsimiles traditionally not included in critical editions, common in monographs and articles":2,"forming students on working with database":2,"free mobile app":3,"generally found in public libraries and conservation institutes":3,"historical sources":1,"importance of national catalogues":1,"in-person exhibitions and tours":6,"in-person interactions with primary school pupils":3,"in-person training for language teachers":2,"internal project documentation":1,"internet archive (archive.org)":5,"iscriptions on different materials (can be undeciphered)":2,"journal articles":9,"lexical databases":1,"lexicons and dictionaries":1,"limits of facsimile":5,"literary texts (e.g. novels)":2,"local libraries' online catalogues":1,"manuscripts from the Middle Ages":3,"manuscripts scattered around many Libraries across the World":2,"monographs are rarely accessible online":1,"monographs are the main publication in my field":2,"museum and archival documentation":2,"need to negotiate with museum for intellectual property and access":4,"no documentation or standards in my discipline":5,"not digitized, sometimes not catalogued":2,"online archive of useful materials":5,"originals to be handled very carefully":1,"other uses of archives":4,"pandemic forced to move events online":2,"personal photos allowed for research purposes":6,"pilot study for further analysis":1,"platform collects data from users and profiles them":2,"platform to access cultural heritage and citizen curation online":4,"preceding academic work on the same subject":19,"preparatory drawings, sketches":1,"preparatory materials for contemporary translations":1,"previous criticism of a certain literary or artistic work":2,"previous translations":2,"printed books and manuscripts from the Renaissance":4,"published in OA":4,"published materials for collecting linguistic data through storytelling":6,"published teaching materials and manuals":2,"published with traditional academic publishers":15,"resources from '800 and '900 are often available online":3,"scattered around the world":2,"sematic reasoner and ontology":2,"slowly moving towards making corpora available to the public":1,"small corpora, qualitative but objective analysis":1,"socio-linguistic profile of speakers":3,"software documentation":1,"some libraries are doing a good job at digitizing":1,"standard languages (XML, RDF, etc)":2,"stemma codicum":4,"the artifact is fundamental":2,"the primary sources being edited are extremely varied":7,"thesaurus linguae graecae":2,"unpublished images":1,"unpublished letters":2,"unpublished teaching materials":1,"using storytelling to gather linguistic production data":2,"usually but not always the reading edition has a wider public than the critical":6,"video recordings for prossemics":1,"web standards":1,"website for dissemination to the wider public":8,"website hosted for free on University platform":3},"methodologies and workflows":{"Lachmann's method":3,"adding to the work previously done by others":1,"analysis is both quantitative and qualitative":1,"approach to document is mutuated from paleography and papirology (new philology)":4,"audio-visual materials are fundamental":1,"authorial philology, Contini onwards":2,"best practices often more important than theoretical considerations":3,"changing editing standards":1,"clear methodologies and paradigms":3,"comparatism relatively new to Italy":1,"concerns about long-term preservation":3,"coptology and egyptology are rare in Italian Universities":2,"data is rarely (but increasingly) shared together with aggregated results":7,"deleting working materials at the end of the project":4,"difference between paleography and diplomatics":1,"difficult to standardise, every archive is different":2,"discarded material can be useful for teaching and further research":10,"documents bounded together are part of a system":1,"ethical issues in linguistics":2,"external hard-drive":4,"formalization is scarce":4,"horizontal, not vertical, division of labour":4,"how to examine documents in archives":2,"importance of a teacher passing method on to students":4,"importance of close reading and reflection":1,"importance of having a specific point of view":1,"importance of intuition, as opposed to a method":6,"informal sharing is common practice":8,"keeping an organized archive of everything":6,"keeping working materials after the end of the project":23,"knowledge of many languages needed":3,"linguistics has different methodologies":5,"linking database and critical editions":1,"methodological choices are documented":1,"methodologies are formalized in manuals":9,"methodologies should be preserved":3,"methodology is \"deposited\" through practice":3,"mixing methodologies from classical and modern philology":2,"multidisciplinarity":7,"my method is close to historiography":2,"no description of methods in the published work":1,"no methodology, no discipline":2,"outputs of research are becoming more varied":1,"philology as a discipline is deeply formalized":7,"photo archive is fundamental":1,"published transcription standards":3,"publishing underlying data":1,"recentio using library catalogues":3,"reusing code":1,"romance philology requires comparativism":3,"seminal critical editions set the standard":3,"single witness":3,"specificities of the humanities":17,"student-teacher collaboration":7,"terrible organization and repeated data losses":1,"theorization of the discipline still ongoing":3,"use of library services":7,"using Drive for cloud storage":8,"using Dropbox for cloud storage":7,"using Facebook to communicate":2,"using a third-party archive":3,"using email and phone to communicate":2,"using other (non specified) cloud storage":1,"using software for corpora creation":1,"using tech to revolutionize state of the art":2,"videoconference tools":1,"visual philology":2,"working alone":8,"working with Excel":5,"working with MS Word":6,"working with others as part of a team":21,"working with others through consultations":13},"research evaluation":{"fears around research ideas being stolen":6,"not everything in research can be measured":5,"research evaluation stifles collaboration and openess":2,"research evaluation stifles innovation":1,"we need to find new ways of measuring research in the humanities":3},"statements on open science, open data, open access":{"OA is not common in my field":1,"OA should be the norm for journals":2,"Universities should make tools available to their researchers":4,"academics are invited to apply for EU-funded projects":1,"concerns around APC/BPC":2,"concerns around the new rules for EU-funded projects":4,"definition of open data":1,"making data available and reusable is an entirely new job":1,"most publications in my field are OA and digital":1,"need to give back to people what you are studying":2,"open data pertains to the humanities?":1,"primary sources in Libraries should be digitized and made available":3,"problems in accessing funding":3,"traditional publishers protect academic works excessively":2,"we make available articles and curated datasets":1,"willingness to share research data":5},"statements on technology":{"importance of pen and paper":6,"technology allowing advances in the discipline":5,"technology changed the way of working":9}},"kind":"hierarchy"}}}</figure-records>
+<figure-records>{"example-accumulation":{"binding":{"asset_id":"cbcb33c8e1983e9dfe40517949323d50b916607a7c8d1a067656af0b58a792d4","source_version":"41dc40a938873e1710d074b85f545f008812e4865616a74f8dc4f54df8a7f3d6"},"environment":{"font":"DejaVu Sans","matplotlib":"3.11.2","python":"3.14.6","scipy":"not installed"},"members":{"figure.py":"f580d665b60f70c6207bd7e44a5be6c187c71af21a7d98906958a7972edc09f8","figure_accumulation.pdf":"925dd697c92781de60e021d8a7258c2413be9b7c9bfafc03a73cfd2ced5047a9","figure_accumulation.png":"a09a752d3b5c52e1d52688fe1a764f8e499e8bf692dbc00ca6b4bffa3757a66b","figure_accumulation.svg":"a93b57162c46bc08d5cb247bae17d4e6a9ca7cf49cd0c61206fdf9ca85e97616","figure_data.csv":"58c1b0854746b698bf97479f5e9642c5cce5e20b07fd9ea81492f1bb7af97879"},"options":{"annotate":true,"cluster":false,"color":"#73a89a","credit":"Interviews in file-name order, not the order conducted. A plateau is not saturation.","dpi":300,"figsize":11.0,"font":"DejaVu Sans","fontsize":10,"kind":"accumulation","level":"code","method":"ward","mode":"overlap","name":"figure_accumulation","palette":"YlGnBu","subtitle":"","title":"Code accumulation curve","top":15},"result":{"cases":["interview02-english-excerpts.txt","interview03-english-excerpts.txt","interview04-english-excerpts.txt"],"codings":11,"cumulative":[5,7,10],"kind":"accumulation"}},"example-cooccurrence":{"binding":{"asset_id":"06403d13c2e1e82da9251db7babecdfc4e1077785869eef7b7764f6d9d14b7fa","source_version":"41dc40a938873e1710d074b85f545f008812e4865616a74f8dc4f54df8a7f3d6"},"environment":{"font":"DejaVu Sans","matplotlib":"3.11.2","python":"3.14.6","scipy":"not installed"},"members":{"figure.py":"46b85d5dbab8c35b1eac39a30c4ac135691d5261ff650ce5f9ed84c5273dcd68","figure_cooccurrence.pdf":"3f343090907eacb3dce628567f1e1cc6691e1d96385fa2a27fd63be67264417a","figure_cooccurrence.png":"1c5a417cad78031c2d7b038efbcd4a0f407e2254bb67db5d70154d0c020e6119","figure_cooccurrence.svg":"dbe3bdab9e22bf39ed01dd0aeff23e5c5f8298962476be235943d33b461bb4c0","figure_data.csv":"7f040f6e0b9137f866b97903aa5214aab947bb20a6644d0e1139b282e6cad138"},"options":{"annotate":true,"cluster":false,"color":"#73a89a","credit":"Codes whose character ranges overlap within one interview. Descriptive; not correlation. Diagonal counts the units a code appears in, not pairs.","dpi":300,"figsize":11.0,"font":"DejaVu Sans","fontsize":10,"kind":"cooccurrence","level":"code","method":"ward","mode":"overlap","name":"figure_cooccurrence","palette":"YlGnBu","subtitle":"Descriptive only: two codes sharing a range, not a correlation.","title":"Overlapping-range co-occurrence","top":15},"result":{"codings":11,"kind":"cooccurrence","labels":["critically-reconstructed text","Google Books","Munich Staats Bibliotek","attitudes towards digital scholarly editions","difference between paleography and diplomatics","digitisation has changed the way of working on the documents","manuscripts from the Middle Ages","printed books and manuscripts from the Renaissance","stemma codicum","website for dissemination to the wider public"],"matrix":[[2,0,0,0,0,0,0,0,1,0],[0,1,0,0,0,1,0,0,0,0],[0,0,1,0,0,1,0,0,0,0],[0,0,0,1,0,0,0,0,0,0],[0,0,0,0,1,0,0,0,0,0],[0,1,1,0,0,1,0,0,0,0],[0,0,0,0,0,0,1,0,0,0],[0,0,0,0,0,0,0,1,0,0],[1,0,0,0,0,0,0,0,1,0],[0,0,0,0,0,0,0,0,0,1]],"mode":"overlap"}},"example-coverage":{"binding":{"asset_id":"07b090cbcd0623c9fe23da5240f1a7371d0f96a621392022c02bab515289409b","source_version":"41dc40a938873e1710d074b85f545f008812e4865616a74f8dc4f54df8a7f3d6"},"environment":{"font":"DejaVu Sans","matplotlib":"3.11.2","python":"3.14.6","scipy":"not installed"},"members":{"figure.py":"ada773385d5c1c9dafba4dc7dc64b597a8100c07b29916d77655f1ab9bd235f1","figure_coverage.pdf":"f4fb58029401bc99f33e6f21f9fb3828910a3529e73ec1cb0eacfabd4801a49f","figure_coverage.png":"dacedbc1ffb0a2e0cf0c4fb5b8dd9056eecdc475f66cf346eee6c881df35a885","figure_coverage.svg":"1092586d67705dcf1dc2bd9c6790a8475c940400a722ee0f0016f7659c230ca7","figure_data.csv":"e167f1fdbd3c347b28e95679e9123faa66564d2035be7518141c073c21046ad2"},"options":{"annotate":true,"cluster":false,"color":"#73a89a","credit":"Counts passage-code assignments, not participants. Zero means no coding in this interview.","dpi":300,"figsize":11.0,"font":"DejaVu Sans","fontsize":10,"kind":"coverage","level":"code","method":"ward","mode":"overlap","name":"figure_coverage","palette":"YlGnBu","subtitle":"","title":"Code-by-interview matrix","top":15},"result":{"cases":["interview02-english-excerpts.txt","interview03-english-excerpts.txt","interview04-english-excerpts.txt"],"codings":11,"kind":"coverage","labels":["critically-reconstructed text","Google Books","Munich Staats Bibliotek","attitudes towards digital scholarly editions","difference between paleography and diplomatics","digitisation has changed the way of working on the documents","manuscripts from the Middle Ages","printed books and manuscripts from the Renaissance","stemma codicum","website for dissemination to the wider public"],"matrix":[[1,1,1,0,0,1,0,1,0,0],[1,0,0,0,0,0,0,0,1,1],[0,0,0,1,1,0,1,0,0,0]]}},"example-frequency":{"binding":{"asset_id":"5672504a9e6bb4aada57abd22e518c201efdd158be37941dba0ed63001a262ca","source_version":"41dc40a938873e1710d074b85f545f008812e4865616a74f8dc4f54df8a7f3d6"},"environment":{"font":"DejaVu Sans","matplotlib":"3.11.2","python":"3.14.6","scipy":"not installed"},"members":{"figure.py":"cb9d0a4ace383338ab042e77788b7bc3a73bb564ef5368b8a8221a23ff1ef7ed","figure_data.csv":"735399c7d67eb3248f69f95ae227481ee9c8b215a516b0d8dd6b916d8c44385e","figure_frequency.pdf":"6c0d1bff65d57cc8ec73db2e07608bc1488bab11d675c02ab053794c74ddce7c","figure_frequency.png":"04301813b5fab397d8ea2cc1ee6be989d16d85dedf399d6485917d6c0fa3cade","figure_frequency.svg":"2343ab211d653ce68b369e98f2568b3737a0a4b110ce358aa01ca6a7c34d30cb"},"options":{"annotate":true,"cluster":false,"color":"#73a89a","credit":"Counts passage-code assignments, not participants. Frequency is not importance.","dpi":300,"figsize":11.0,"font":"DejaVu Sans","fontsize":10,"kind":"frequency","level":"code","method":"ward","mode":"overlap","name":"figure_frequency","palette":"YlGnBu","subtitle":"","title":"Code frequency","top":15},"result":{"codings":11,"counts":[2,1,1,1,1,1,1,1,1,1],"kind":"frequency","labels":["critically-reconstructed text","Google Books","Munich Staats Bibliotek","attitudes towards digital scholarly editions","difference between paleography and diplomatics","digitisation has changed the way of working on the documents","manuscripts from the Middle Ages","printed books and manuscripts from the Renaissance","stemma codicum","website for dissemination to the wider public"],"level":"code"}},"example-hierarchy":{"binding":{"asset_id":"97acc32af830a1c740a2d34970dd9174684713461e00a0fd651cf3c8b25f03ab","source_version":"41dc40a938873e1710d074b85f545f008812e4865616a74f8dc4f54df8a7f3d6"},"environment":{"font":"DejaVu Sans","matplotlib":"3.11.2","python":"3.14.6","scipy":"not installed"},"members":{"figure.py":"4b258b83cf7a0f04b41a611008b8dc38ef94e9cb6904e35d58b171510b73fa9c","figure_data.csv":"da348b4f960a9e8ea2d7a936fe55edae4ac827ee2751a6951b7a9ec070f2abab","figure_hierarchy.pdf":"d3a6392e24ae79c06b941ce0dad328d82ffd584dde597041991311dc46804e9f","figure_hierarchy.png":"7d32c7cc8c56ee2dac44c71c38ff3eec10888363a136973e13c0ef3b93ca8b68","figure_hierarchy.svg":"e95559cf1764037b85d544eecede8bf312d538185b9b8209b92c3c091f7adcad"},"options":{"annotate":true,"cluster":false,"color":"#73a89a","credit":"Counts coded extracts per section and subsection, not participants.","dpi":300,"figsize":11.0,"font":"DejaVu Sans","fontsize":10,"kind":"hierarchy","level":"code","method":"ward","mode":"overlap","name":"figure_hierarchy","palette":"YlGnBu","subtitle":"","title":"Themes and named subthemes","top":15},"result":{"codings":11,"hierarchy":{"materials":{"Google Books":1,"Munich Staats Bibliotek":1,"attitudes towards digital scholarly editions":1,"critically-reconstructed text":2,"digitisation has changed the way of working on the documents":1,"manuscripts from the Middle Ages":1,"printed books and manuscripts from the Renaissance":1,"stemma codicum":1,"website for dissemination to the wider public":1},"methodologies and workflows":{"difference between paleography and diplomatics":1}},"kind":"hierarchy"}}}</figure-records>
 </file>
</xml_diff>